<commit_message>
content(cv): sync résumé .docx with portfolio + confidentiality scoping
- MCP/agents dates aligned (2025–Present / 2024–2025)
- 108 tools (drop tilde); soften MCP to "replaces manual SQL with a
  conversational interface" (no client names / no unreleased roadmap)
- Drop named streaming platforms -> "global streaming services in many regions"
- gitignore *.bak
</commit_message>
<xml_diff>
--- a/public/CV_Eleana_Rinaudo.docx
+++ b/public/CV_Eleana_Rinaudo.docx
@@ -213,7 +213,8 @@
           <w:sz w:val="20"/>
           <w:szCs w:val="20"/>
         </w:rPr>
-        <w:t xml:space="preserve">	2026 – Present</w:t>
+        <w:tab/>
+        <w:t>2025 – Present</w:t>
       </w:r>
     </w:p>
     <w:p>
@@ -230,7 +231,7 @@
           <w:sz w:val="21"/>
           <w:szCs w:val="21"/>
         </w:rPr>
-        <w:t xml:space="preserve">Architected and built, as sole primary author, a production Model Context Protocol (MCP) server exposing ~108 tools across 13 domains that connects LLM clients (Claude, ChatGPT) to AWS Athena, using a hexagonal / ports-and-adapters architecture.</w:t>
+        <w:t>Architected and built, as sole primary author, a production Model Context Protocol (MCP) server exposing 108 tools across 13 domains that lets LLM clients query AWS Athena in natural language — replacing manual SQL with a conversational interface, using a hexagonal / ports-and-adapters architecture.</w:t>
       </w:r>
     </w:p>
     <w:p>
@@ -264,7 +265,7 @@
           <w:sz w:val="21"/>
           <w:szCs w:val="21"/>
         </w:rPr>
-        <w:t xml:space="preserve">Implemented OAuth 2.0 auth (AWS Cognito + Google SSO, RS256 JWT), tiered rate limiting, and an Athena circuit breaker; added a REST / OpenAPI 3.1 adapter for ChatGPT.</w:t>
+        <w:t>Implemented OAuth 2.0 auth (AWS Cognito + Google SSO, RS256 JWT), tiered rate limiting, and an Athena circuit breaker; added a REST / OpenAPI 3.1 adapter.</w:t>
       </w:r>
     </w:p>
     <w:p>
@@ -309,7 +310,8 @@
           <w:sz w:val="20"/>
           <w:szCs w:val="20"/>
         </w:rPr>
-        <w:t xml:space="preserve">	2025 – 2026</w:t>
+        <w:tab/>
+        <w:t>2024 – 2025</w:t>
       </w:r>
     </w:p>
     <w:p>
@@ -467,7 +469,7 @@
           <w:sz w:val="21"/>
           <w:szCs w:val="21"/>
         </w:rPr>
-        <w:t xml:space="preserve">Built and maintained 30+ streaming-platform data-collection agents (scrapers) in a large shared Python monorepo (~825 commits over 2.5 years), extracting catalog metadata — titles, series, seasons, episodes — across global services (Britbox, DAZN, iQIYI, HBO Go Asia, Cineverse, Lionsgate+, and many more).</w:t>
+        <w:t>Built and maintained 30+ streaming-platform data-collection agents (scrapers) in a large shared Python monorepo (~825 commits over 2.5 years), extracting catalog metadata — titles, series, seasons, episodes — across global streaming services in many regions.</w:t>
       </w:r>
     </w:p>
     <w:p>

</xml_diff>

<commit_message>
fix(content): correct erroneous stats (years + MCP tool count)
- Hero stats: "5+ yrs shipping data products" -> "4+ yrs in data & AI";
  "108 MCP tools" -> "13 MCP domains" (the disputed tool count is gone)
- Drop "5+ years shipping data products at scale" from About + CV summary
- MCP everywhere now "spanning 13 domains" (no tool-count claim): experience
  bullet, project card, and CV .docx
- gitignore *.bak* (covers .bak2)
</commit_message>
<xml_diff>
--- a/public/CV_Eleana_Rinaudo.docx
+++ b/public/CV_Eleana_Rinaudo.docx
@@ -115,7 +115,7 @@
           <w:sz w:val="21"/>
           <w:szCs w:val="21"/>
         </w:rPr>
-        <w:t xml:space="preserve">AI/ML Engineer who built the full data lifecycle of a media &amp; entertainment data platform — from large-scale web-scraping data ingestion, through ML enrichment, to a production LLM access layer (Model Context Protocol). Strong end-to-end: Python backends, agentic orchestration (LangChain/LangGraph), AWS infrastructure (ECS/Terraform), and React frontends. 5+ years shipping data products at scale.</w:t>
+        <w:t>AI/ML Engineer who built the full data lifecycle of a media &amp; entertainment data platform — from large-scale web-scraping data ingestion, through ML enrichment, to a production LLM access layer (Model Context Protocol). Strong end-to-end: Python backends, agentic orchestration (LangChain/LangGraph), AWS infrastructure (ECS/Terraform), and React frontends.</w:t>
       </w:r>
     </w:p>
     <w:p>
@@ -231,7 +231,7 @@
           <w:sz w:val="21"/>
           <w:szCs w:val="21"/>
         </w:rPr>
-        <w:t>Architected and built, as sole primary author, a production Model Context Protocol (MCP) server exposing 108 tools across 13 domains that lets LLM clients query AWS Athena in natural language — replacing manual SQL with a conversational interface, using a hexagonal / ports-and-adapters architecture.</w:t>
+        <w:t>Architected and built, as sole primary author, a production Model Context Protocol (MCP) server spanning 13 domains that lets LLM clients query AWS Athena in natural language — replacing manual SQL with a conversational interface, using a hexagonal / ports-and-adapters architecture.</w:t>
       </w:r>
     </w:p>
     <w:p>

</xml_diff>